<commit_message>
Rapport : section 6 sur le diagnostic du controle d'age
Ajoute la fonction de reponse mesuree (figure 5), la cause racine (support
d'age degenere a cinq valeurs, tranche 18-19 perdue), la portee reelle des
corrections a l'inference et la correction a la racine. Corrige deux
affirmations que la mesure contredit : l'attribution de la MAE d'age a des
facteurs de mesure, et la lecture de la figure d'interpolation comme preuve
que l'ordre des ages est appris.
</commit_message>
<xml_diff>
--- a/rapport/Rapport_Experiences_Resultats.docx
+++ b/rapport/Rapport_Experiences_Resultats.docx
@@ -3862,7 +3862,124 @@
         <w:rPr>
           <w:rFonts w:ascii="Calibri" w:cs="Calibri" w:eastAsia="Calibri" w:hAnsi="Calibri"/>
         </w:rPr>
-        <w:t xml:space="preserve">6. Analyse critique et limites</w:t>
+        <w:t xml:space="preserve">6. Le contrôle d'âge à l'épreuve : diagnostic d'un défaut de données</w:t>
+      </w:r>
+    </w:p>
+    <w:p>
+      <w:pPr>
+        <w:spacing w:after="160" w:line="300"/>
+        <w:jc w:val="both"/>
+      </w:pPr>
+      <w:r>
+        <w:rPr>
+          <w:rFonts w:ascii="Calibri" w:cs="Calibri" w:eastAsia="Calibri" w:hAnsi="Calibri"/>
+          <w:sz w:val="22"/>
+          <w:szCs w:val="22"/>
+        </w:rPr>
+        <w:t xml:space="preserve">La MAE d'âge de 12,5 ans du §2 est trop élevée pour être imputée au seul bruit de mesure. Nous avons donc instrumenté le modèle plutôt que de commenter un agrégat : au lieu d'une erreur moyenne, nous mesurons la fonction de réponse du générateur, c'est-à-dire l'âge effectivement perçu sur les visages produits en fonction de l'âge demandé. Le protocole tire 14 âges de consigne régulièrement espacés sur 18-70 ans, génère 48 visages par consigne (genre et peau aléatoires, w = 3, DDIM 50 pas) et fait juger chaque lot par le classifieur d'attributs (script src/age_response.py).</w:t>
+      </w:r>
+    </w:p>
+    <w:p>
+      <w:pPr>
+        <w:spacing w:after="60" w:before="160"/>
+        <w:jc w:val="center"/>
+      </w:pPr>
+      <w:r>
+        <w:drawing>
+          <wp:inline distT="0" distB="0" distL="0" distR="0">
+            <wp:extent cx="5029200" cy="3592285"/>
+            <wp:effectExtent t="0" r="0" b="0" l="0"/>
+            <wp:docPr id="90" name="" descr="" title=""/>
+            <wp:cNvGraphicFramePr>
+              <a:graphicFrameLocks xmlns:a="http://schemas.openxmlformats.org/drawingml/2006/main" noChangeAspect="1"/>
+            </wp:cNvGraphicFramePr>
+            <a:graphic xmlns:a="http://schemas.openxmlformats.org/drawingml/2006/main">
+              <a:graphicData uri="http://schemas.openxmlformats.org/drawingml/2006/picture">
+                <pic:pic xmlns:pic="http://schemas.openxmlformats.org/drawingml/2006/picture">
+                  <pic:nvPicPr>
+                    <pic:cNvPr id="0" name="" descr=""/>
+                    <pic:cNvPicPr>
+                      <a:picLocks noChangeAspect="1" noChangeArrowheads="1"/>
+                    </pic:cNvPicPr>
+                  </pic:nvPicPr>
+                  <pic:blipFill>
+                    <a:blip r:embed="rId13" cstate="none"/>
+                    <a:srcRect/>
+                    <a:stretch>
+                      <a:fillRect/>
+                    </a:stretch>
+                  </pic:blipFill>
+                  <pic:spPr bwMode="auto">
+                    <a:xfrm>
+                      <a:off x="0" y="0"/>
+                      <a:ext cx="5029200" cy="3592285"/>
+                    </a:xfrm>
+                    <a:prstGeom prst="rect">
+                      <a:avLst/>
+                    </a:prstGeom>
+                  </pic:spPr>
+                </pic:pic>
+              </a:graphicData>
+            </a:graphic>
+          </wp:inline>
+        </w:drawing>
+      </w:r>
+    </w:p>
+    <w:p>
+      <w:pPr>
+        <w:spacing w:after="220"/>
+        <w:jc w:val="center"/>
+      </w:pPr>
+      <w:r>
+        <w:rPr>
+          <w:rFonts w:ascii="Calibri" w:cs="Calibri" w:eastAsia="Calibri" w:hAnsi="Calibri"/>
+          <w:i/>
+          <w:iCs/>
+          <w:color w:val="666666"/>
+          <w:sz w:val="18"/>
+          <w:szCs w:val="18"/>
+        </w:rPr>
+        <w:t xml:space="preserve">Figure 5 - Fonction de réponse en âge du DDPM v1. En pointillés, le contrôle parfait ; en rouge, la réponse mesurée (moyenne ± écart-type sur 48 visages). La bande bleue délimite le support d'âge réellement présent dans les données d'entraînement, les traits verticaux les cinq seules valeurs d'âge que le modèle a pu observer.</w:t>
+      </w:r>
+    </w:p>
+    <w:p>
+      <w:pPr>
+        <w:spacing w:after="160" w:line="300"/>
+        <w:jc w:val="both"/>
+      </w:pPr>
+      <w:r>
+        <w:rPr>
+          <w:rFonts w:ascii="Calibri" w:cs="Calibri" w:eastAsia="Calibri" w:hAnsi="Calibri"/>
+          <w:sz w:val="22"/>
+          <w:szCs w:val="22"/>
+        </w:rPr>
+        <w:t xml:space="preserve">Le résultat est sans appel : la réponse est plate. L'âge perçu reste confiné entre 36,4 et 44,1 ans — une amplitude de 7,7 ans — alors que la consigne balaie 52 ans. Le modèle ne se contente pas d'être imprécis sur l'âge : il ignore la condition et reproduit systématiquement l'âge moyen du jeu de données. La MAE de 12,5 ans n'est donc pas une erreur de contrôle, c'est la dispersion résiduelle d'une distribution non conditionnée.</w:t>
+      </w:r>
+    </w:p>
+    <w:p>
+      <w:pPr>
+        <w:pStyle w:val="Heading2"/>
+        <w:spacing w:after="120" w:before="240"/>
+      </w:pPr>
+      <w:r>
+        <w:rPr>
+          <w:rFonts w:ascii="Calibri" w:cs="Calibri" w:eastAsia="Calibri" w:hAnsi="Calibri"/>
+        </w:rPr>
+        <w:t xml:space="preserve">6.1 Cause racine : un support d'entraînement dégénéré</w:t>
+      </w:r>
+    </w:p>
+    <w:p>
+      <w:pPr>
+        <w:spacing w:after="160" w:line="300"/>
+        <w:jc w:val="both"/>
+      </w:pPr>
+      <w:r>
+        <w:rPr>
+          <w:rFonts w:ascii="Calibri" w:cs="Calibri" w:eastAsia="Calibri" w:hAnsi="Calibri"/>
+          <w:sz w:val="22"/>
+          <w:szCs w:val="22"/>
+        </w:rPr>
+        <w:t xml:space="preserve">L'explication n'est pas dans le modèle mais dans le chargeur de données. FairFace n'annote pas l'âge à l'année mais par tranches (0-2, 3-9, 10-19, 20-29, …). Notre pipeline ramenait chaque tranche à son point médian, puis appliquait le filtre 18-70 ans imposé par le sujet. L'enchaînement de ces deux opérations, anodin en apparence, a deux conséquences que la lecture des seules métriques agrégées ne pouvait pas révéler :</w:t>
       </w:r>
     </w:p>
     <w:p>
@@ -3883,7 +4000,7 @@
           <w:sz w:val="22"/>
           <w:szCs w:val="22"/>
         </w:rPr>
-        <w:t xml:space="preserve">MAE d'âge élevée (~12,5 ans) : </w:t>
+        <w:t xml:space="preserve">Support réduit à cinq points : </w:t>
       </w:r>
       <w:r>
         <w:rPr>
@@ -3891,7 +4008,7 @@
           <w:sz w:val="22"/>
           <w:szCs w:val="22"/>
         </w:rPr>
-        <w:t xml:space="preserve">trois facteurs se cumulent - l'annotation FairFace par tranches (le « vrai » âge est déjà approximé au milieu de tranche), le juge qui commet 6,5 ans d'erreur sur images réelles, et la difficulté intrinsèque d'estimer l'âge à 48 px. L'erreur imputable au seul générateur est donc nettement inférieure au chiffre brut ; la Figure 4 montre que l'ordre des âges est, lui, bien appris.</w:t>
+        <w:t xml:space="preserve">après filtrage, les seuls âges présents dans les 64 599 images d'entraînement sont 24,5, 34,5, 44,5, 54,5 et 64,5 ans. L'encodage sinusoïdal continu de l'âge, choisi précisément pour permettre un contrôle continu, n'a jamais reçu qu'un signal à cinq niveaux.</w:t>
       </w:r>
     </w:p>
     <w:p>
@@ -3912,7 +4029,7 @@
           <w:sz w:val="22"/>
           <w:szCs w:val="22"/>
         </w:rPr>
-        <w:t xml:space="preserve">Résolution 48 px : </w:t>
+        <w:t xml:space="preserve">Tranche 18-19 ans entièrement perdue : </w:t>
       </w:r>
       <w:r>
         <w:rPr>
@@ -3920,7 +4037,113 @@
           <w:sz w:val="22"/>
           <w:szCs w:val="22"/>
         </w:rPr>
-        <w:t xml:space="preserve">choix de budget (18 h d'entraînement sur MPS). Les FID absolus (40-67) ne sont pas comparables aux références haute résolution de la littérature (StyleGAN2 ~3 sur FFHQ 1024 px) ; seules les comparaisons internes, à protocole constant, sont interprétables - c'est ainsi qu'elles sont présentées.</w:t>
+        <w:t xml:space="preserve">la tranche 10-19 a pour point médian 15 ans, éliminé par le filtre — alors qu'elle contient les 18 et 19 ans explicitement demandés par le cahier des charges. 9 103 images ont ainsi été écartées à tort.</w:t>
+      </w:r>
+    </w:p>
+    <w:p>
+      <w:pPr>
+        <w:spacing w:after="160" w:line="300"/>
+        <w:jc w:val="both"/>
+      </w:pPr>
+      <w:r>
+        <w:rPr>
+          <w:rFonts w:ascii="Calibri" w:cs="Calibri" w:eastAsia="Calibri" w:hAnsi="Calibri"/>
+          <w:sz w:val="22"/>
+          <w:szCs w:val="22"/>
+        </w:rPr>
+        <w:t xml:space="preserve">Le protocole d'évaluation amplifiait le phénomène : les conditions d'âge y étaient tirées uniformément sur 18-70 ans, donc majoritairement hors du support appris. Mesurée dans le seul support d'entraînement, la MAE tombe à 10,8 ans contre 14,3 ans en tirage uniforme ; l'écart chiffre le coût de l'extrapolation. Les deux protocoles sont désormais rapportés séparément (option --age-sampling support | uniform).</w:t>
+      </w:r>
+    </w:p>
+    <w:p>
+      <w:pPr>
+        <w:spacing w:after="160" w:line="300"/>
+        <w:jc w:val="both"/>
+      </w:pPr>
+      <w:r>
+        <w:rPr>
+          <w:rFonts w:ascii="Calibri" w:cs="Calibri" w:eastAsia="Calibri" w:hAnsi="Calibri"/>
+          <w:sz w:val="22"/>
+          <w:szCs w:val="22"/>
+        </w:rPr>
+        <w:t xml:space="preserve">Deux éléments confirment que le défaut est spécifique à l'âge et non un échec général du conditionnement. D'une part le genre (89,6 %) et la peau (45,8 %, pour un plafond de juge à 62 %) sont correctement suivis, et leurs supports d'entraînement sont complets. D'autre part le balayage du guidage (§3) montre des pentes très différentes selon l'attribut : de w = 1 à w = 8, la fidélité au genre passe de 71,1 % à 97,0 % et celle à la peau de 25,6 % à 64,8 %, tandis que la MAE d'âge ne gagne que 2,9 ans (14,0 → 11,1). Amplifier le guidage ne fait pas émerger une information que les données n'ont jamais portée.</w:t>
+      </w:r>
+    </w:p>
+    <w:p>
+      <w:pPr>
+        <w:pStyle w:val="Heading2"/>
+        <w:spacing w:after="120" w:before="240"/>
+      </w:pPr>
+      <w:r>
+        <w:rPr>
+          <w:rFonts w:ascii="Calibri" w:cs="Calibri" w:eastAsia="Calibri" w:hAnsi="Calibri"/>
+        </w:rPr>
+        <w:t xml:space="preserve">6.2 Ce qu'une correction à l'inférence peut, et ne peut pas, faire</w:t>
+      </w:r>
+    </w:p>
+    <w:p>
+      <w:pPr>
+        <w:spacing w:after="160" w:line="300"/>
+        <w:jc w:val="both"/>
+      </w:pPr>
+      <w:r>
+        <w:rPr>
+          <w:rFonts w:ascii="Calibri" w:cs="Calibri" w:eastAsia="Calibri" w:hAnsi="Calibri"/>
+          <w:sz w:val="22"/>
+          <w:szCs w:val="22"/>
+        </w:rPr>
+        <w:t xml:space="preserve">Nous avons d'abord cherché une correction sans ré-entraînement. La réponse mesurée étant monotone par morceaux, on peut en principe l'inverser et injecter, pour un âge voulu, la valeur de condition qui le produit réellement (calibration post-hoc, src/sampling.py). Cette voie est ici sans objet : une fonction d'amplitude 7,7 ans n'est pas inversible sur une plage de 52 ans. Le code le détecte et refuse la calibration (applicable : false) au lieu d'habiller une absence de contrôle par une table de correspondance. Nous le mentionnons parce que la tentation inverse — publier une calibration qui « améliore » la métrique sans rien changer au modèle — est exactement le type d'artefact qu'une évaluation de système génératif doit exclure.</w:t>
+      </w:r>
+    </w:p>
+    <w:p>
+      <w:pPr>
+        <w:spacing w:after="160" w:line="300"/>
+        <w:jc w:val="both"/>
+      </w:pPr>
+      <w:r>
+        <w:rPr>
+          <w:rFonts w:ascii="Calibri" w:cs="Calibri" w:eastAsia="Calibri" w:hAnsi="Calibri"/>
+          <w:sz w:val="22"/>
+          <w:szCs w:val="22"/>
+        </w:rPr>
+        <w:t xml:space="preserve">La seconde mitigation reste valide : l'échantillonnage par rejet (best-of-k). On génère k candidats pour une même condition et on retient celui que le classifieur juge le plus conforme (Azadi et al., 2019). Le gain est réel mais borné par la dispersion du modèle (σ ≈ 6 ans), et se paie d'un coût d'échantillonnage multiplié par k ainsi que d'une légère perte de diversité intra-condition. L'option est exposée dans le démonstrateur (--best-of).</w:t>
+      </w:r>
+    </w:p>
+    <w:p>
+      <w:pPr>
+        <w:pStyle w:val="Heading2"/>
+        <w:spacing w:after="120" w:before="240"/>
+      </w:pPr>
+      <w:r>
+        <w:rPr>
+          <w:rFonts w:ascii="Calibri" w:cs="Calibri" w:eastAsia="Calibri" w:hAnsi="Calibri"/>
+        </w:rPr>
+        <w:t xml:space="preserve">6.3 Correction à la racine et ré-entraînement</w:t>
+      </w:r>
+    </w:p>
+    <w:p>
+      <w:pPr>
+        <w:spacing w:after="160" w:line="300"/>
+        <w:jc w:val="both"/>
+      </w:pPr>
+      <w:r>
+        <w:rPr>
+          <w:rFonts w:ascii="Calibri" w:cs="Calibri" w:eastAsia="Calibri" w:hAnsi="Calibri"/>
+          <w:sz w:val="22"/>
+          <w:szCs w:val="22"/>
+        </w:rPr>
+        <w:t xml:space="preserve">La seule correction rétablissant un contrôle véritable porte sur les données. Le mode --age-jitter tire l'âge uniformément dans la tranche annotée, bornée à 18-70 ans, au lieu d'en prendre le point médian. Le support redevient continu (285 valeurs distinctes sur un échantillon de 300 tirages, contre 5) et les 18-19 ans sont récupérés : le jeu d'entraînement passe de 64 599 à 73 702 images. Le modèle est repris depuis le checkpoint existant — les 18 heures déjà investies ne sont pas perdues — et affiné à faible pas d'apprentissage (5e-5) dans un répertoire distinct, afin que la comparaison avant/après reste reproductible.</w:t>
+      </w:r>
+    </w:p>
+    <w:p>
+      <w:pPr>
+        <w:pStyle w:val="Heading1"/>
+        <w:spacing w:after="200" w:before="360"/>
+      </w:pPr>
+      <w:r>
+        <w:rPr>
+          <w:rFonts w:ascii="Calibri" w:cs="Calibri" w:eastAsia="Calibri" w:hAnsi="Calibri"/>
+        </w:rPr>
+        <w:t xml:space="preserve">7. Analyse critique et limites</w:t>
       </w:r>
     </w:p>
     <w:p>
@@ -3941,7 +4164,7 @@
           <w:sz w:val="22"/>
           <w:szCs w:val="22"/>
         </w:rPr>
-        <w:t xml:space="preserve">Artefacts résiduels : </w:t>
+        <w:t xml:space="preserve">MAE d'âge élevée (~12,5 ans) : </w:t>
       </w:r>
       <w:r>
         <w:rPr>
@@ -3949,7 +4172,7 @@
           <w:sz w:val="22"/>
           <w:szCs w:val="22"/>
         </w:rPr>
-        <w:t xml:space="preserve">environ 10-15 % des tirages présentent des textures saturées, fréquence qui augmente avec w (cohérent avec la dégradation du FID mesurée en §3). Baisser w ou augmenter les pas DDIM les réduit.</w:t>
+        <w:t xml:space="preserve">le §6 en établit la cause dominante — un support d'âge dégénéré à cinq valeurs, qui rend la condition d'âge inopérante sur le modèle v1. Deux facteurs de mesure s'y ajoutent, sans l'expliquer : le juge commet déjà 6,5 ans d'erreur sur images réelles, et l'âge est difficile à estimer à 48 px. La planche d'interpolation (Figure 4) donne une impression de progression d'âge que la mesure systématique du §6 ne confirme pas : elle illustre la continuité de la trajectoire dans l'espace d'embedding, pas la fidélité de l'âge produit.</w:t>
       </w:r>
     </w:p>
     <w:p>
@@ -3970,7 +4193,7 @@
           <w:sz w:val="22"/>
           <w:szCs w:val="22"/>
         </w:rPr>
-        <w:t xml:space="preserve">Fidélité peau inégale : </w:t>
+        <w:t xml:space="preserve">Résolution 48 px : </w:t>
       </w:r>
       <w:r>
         <w:rPr>
@@ -3978,6 +4201,64 @@
           <w:sz w:val="22"/>
           <w:szCs w:val="22"/>
         </w:rPr>
+        <w:t xml:space="preserve">choix de budget (18 h d'entraînement sur MPS). Les FID absolus (40-67) ne sont pas comparables aux références haute résolution de la littérature (StyleGAN2 ~3 sur FFHQ 1024 px) ; seules les comparaisons internes, à protocole constant, sont interprétables - c'est ainsi qu'elles sont présentées.</w:t>
+      </w:r>
+    </w:p>
+    <w:p>
+      <w:pPr>
+        <w:pStyle w:val="ListParagraph"/>
+        <w:numPr>
+          <w:ilvl w:val="0"/>
+          <w:numId w:val="2"/>
+        </w:numPr>
+        <w:spacing w:after="80" w:line="300"/>
+        <w:jc w:val="both"/>
+      </w:pPr>
+      <w:r>
+        <w:rPr>
+          <w:rFonts w:ascii="Calibri" w:cs="Calibri" w:eastAsia="Calibri" w:hAnsi="Calibri"/>
+          <w:b/>
+          <w:bCs/>
+          <w:sz w:val="22"/>
+          <w:szCs w:val="22"/>
+        </w:rPr>
+        <w:t xml:space="preserve">Artefacts résiduels : </w:t>
+      </w:r>
+      <w:r>
+        <w:rPr>
+          <w:rFonts w:ascii="Calibri" w:cs="Calibri" w:eastAsia="Calibri" w:hAnsi="Calibri"/>
+          <w:sz w:val="22"/>
+          <w:szCs w:val="22"/>
+        </w:rPr>
+        <w:t xml:space="preserve">environ 10-15 % des tirages présentent des textures saturées, fréquence qui augmente avec w (cohérent avec la dégradation du FID mesurée en §3). Baisser w ou augmenter les pas DDIM les réduit.</w:t>
+      </w:r>
+    </w:p>
+    <w:p>
+      <w:pPr>
+        <w:pStyle w:val="ListParagraph"/>
+        <w:numPr>
+          <w:ilvl w:val="0"/>
+          <w:numId w:val="2"/>
+        </w:numPr>
+        <w:spacing w:after="80" w:line="300"/>
+        <w:jc w:val="both"/>
+      </w:pPr>
+      <w:r>
+        <w:rPr>
+          <w:rFonts w:ascii="Calibri" w:cs="Calibri" w:eastAsia="Calibri" w:hAnsi="Calibri"/>
+          <w:b/>
+          <w:bCs/>
+          <w:sz w:val="22"/>
+          <w:szCs w:val="22"/>
+        </w:rPr>
+        <w:t xml:space="preserve">Fidélité peau inégale : </w:t>
+      </w:r>
+      <w:r>
+        <w:rPr>
+          <w:rFonts w:ascii="Calibri" w:cs="Calibri" w:eastAsia="Calibri" w:hAnsi="Calibri"/>
+          <w:sz w:val="22"/>
+          <w:szCs w:val="22"/>
+        </w:rPr>
         <w:t xml:space="preserve">voir §4 ; mesure confondue avec le biais du juge.</w:t>
       </w:r>
     </w:p>
@@ -4016,7 +4297,7 @@
         <w:rPr>
           <w:rFonts w:ascii="Calibri" w:cs="Calibri" w:eastAsia="Calibri" w:hAnsi="Calibri"/>
         </w:rPr>
-        <w:t xml:space="preserve">7. Conclusion</w:t>
+        <w:t xml:space="preserve">8. Conclusion</w:t>
       </w:r>
     </w:p>
     <w:p>

</xml_diff>

<commit_message>
Filtre couleur : critere de dominante verte, et deploiement du Space
Le filtre base sur la saturation globale (99e centile du reel) laissait
passer des visages franchement verts : constate sur la demo publiee, deux
tirages sur quatre. Ces tirages ont une saturation normale mais un canal vert
dominant, ce que la saturation ne mesure pas.

Nouveau critere : exces de vert = moyenne du canal vert moins le plus fort
des canaux rouge et bleu. Sur 1024 visages reels de FairFace, mediane -0,123
et 99e centile 0,000 ; les tirages fautifs montent a +0,085. Le taux de rejet
passe de 3,1 % a 16,1 %, avec 0 residuel apres regeneration.

Le taux plus eleve est documente dans le README et au rapport (8.1) : il
s'agit desormais de masquer un defaut present dans un tirage sur six, non un
accident rare. Le filtre reste reserve au demonstrateur et desactivable ;
aucune metrique du rapport ne l'utilise.

Demo en ligne : https://huggingface.co/spaces/keliankey/visage-generation-visage
</commit_message>
<xml_diff>
--- a/rapport/Rapport_Experiences_Resultats.docx
+++ b/rapport/Rapport_Experiences_Resultats.docx
@@ -4699,6 +4699,32 @@
           <w:szCs w:val="22"/>
         </w:rPr>
         <w:t xml:space="preserve">Le modèle livré est v2 en guidage standard (w = 3, supplément d'âge nul) : FID 24,0, MAE d'âge 10,8 ans, genre 86,8 %. Il domine v1 sur le réalisme et sur le contrôle d'âge sans contrepartie à défendre. Le supplément de guidage d'âge reste exposé dans le démonstrateur et documenté par la figure 7 : c'est un curseur que l'utilisateur actionne en connaissance du prix, pas un réglage par défaut.</w:t>
+      </w:r>
+    </w:p>
+    <w:p>
+      <w:pPr>
+        <w:pStyle w:val="Heading2"/>
+        <w:spacing w:after="120" w:before="240"/>
+      </w:pPr>
+      <w:r>
+        <w:rPr>
+          <w:rFonts w:ascii="Calibri" w:cs="Calibri" w:eastAsia="Calibri" w:hAnsi="Calibri"/>
+        </w:rPr>
+        <w:t xml:space="preserve">8.1 Filtre colorimétrique du démonstrateur</w:t>
+      </w:r>
+    </w:p>
+    <w:p>
+      <w:pPr>
+        <w:spacing w:after="160" w:line="300"/>
+        <w:jc w:val="both"/>
+      </w:pPr>
+      <w:r>
+        <w:rPr>
+          <w:rFonts w:ascii="Calibri" w:cs="Calibri" w:eastAsia="Calibri" w:hAnsi="Calibri"/>
+          <w:sz w:val="22"/>
+          <w:szCs w:val="22"/>
+        </w:rPr>
+        <w:t xml:space="preserve">Une fraction des tirages sort de la plage colorimétrique des visages réels, le plus souvent sous la forme d'une dominante verte. Le critère retenu est l'excès de vert, défini comme la moyenne du canal vert moins le plus fort des canaux rouge et bleu. Sur 1024 visages réels de FairFace, sa médiane vaut -0,123 et son 99e centile 0,000 : un visage humain n'est jamais dominé par le vert. Les tirages concernés atteignent +0,085 alors que leur saturation globale reste sous le seuil, si bien qu'un critère de saturation les laissait passer. 16,1 % des tirages franchissent ce seuil, mesuré sur 192 échantillons ; ils sont régénérés, ce qui ramène le taux résiduel à zéro. Ce filtre est réservé au démonstrateur et reste désactivable : appliqué pendant une évaluation, il améliorerait le FID en écartant les mauvais tirages du modèle. Toutes les métriques rapportées ici sont mesurées sans lui.</w:t>
       </w:r>
     </w:p>
     <w:p>

</xml_diff>